<commit_message>
docs: errores conocidos y cómo forzar el JDK 17 en los pasos de prueba
Agrega la tabla de mensajes de error con su causa, empezando por los dos
que ya aparecieron de verdad: gradlew.bat inexistente por falta del
wrapper, y "Unsupported class file major version 65" por Java 21.

El aviso sobre Java 21 deja de ser una recomendación y pasa a ser un
hecho comprobado, con el mensaje exacto que se ve. Se agrega también cómo
apuntar JAVA_HOME al 17 cuando conviven las dos versiones, que es el caso
más probable de quien ya tenía Java instalado.

Co-Authored-By: Claude Opus 5 <noreply@anthropic.com>
Claude-Session: https://claude.ai/code/session_01ND65wgpcS7H9DHzQWDAZ3a
</commit_message>
<xml_diff>
--- a/docs/Atmosia_Pasos_Para_Probarlo.docx
+++ b/docs/Atmosia_Pasos_Para_Probarlo.docx
@@ -391,7 +391,7 @@
                 <w:sz w:val="20"/>
                 <w:szCs w:val="20"/>
               </w:rPr>
-              <w:t xml:space="preserve">No alcanza, pero tampoco es un problema: hay que instalar la 17 igual. Las versiones de Java conviven sin pisarse, así que instalar la 17 no rompe nada de lo que ya tengas ni desinstala la 21.</w:t>
+              <w:t xml:space="preserve">No alcanza, y esto está comprobado, no supuesto: con Java 21 la compilación corta de entrada con el mensaje "Unsupported class file major version 65". Ni siquiera llega a leer el código del mod.</w:t>
             </w:r>
           </w:p>
           <w:p>
@@ -404,7 +404,7 @@
                 <w:sz w:val="20"/>
                 <w:szCs w:val="20"/>
               </w:rPr>
-              <w:t xml:space="preserve">El motivo es que Minecraft 1.20.1 y las herramientas que lo construyen están hechas para la 17. Con una versión más nueva la compilación suele fallar con errores que no dicen nada sobre la causa real, y se pierde más tiempo adivinando que instalando.</w:t>
+              <w:t xml:space="preserve">Hay que instalar la 17 igual. Las versiones de Java conviven sin pisarse: instalar la 17 no desinstala la 21 ni rompe nada de lo que ya tengas.</w:t>
             </w:r>
           </w:p>
           <w:p>
@@ -427,6 +427,67 @@
       <w:pPr>
         <w:spacing w:after="160"/>
       </w:pPr>
+    </w:p>
+    <w:p>
+      <w:pPr>
+        <w:pStyle w:val="Heading3"/>
+        <w:spacing w:after="100" w:before="220"/>
+      </w:pPr>
+      <w:r>
+        <w:rPr>
+          <w:b/>
+          <w:bCs/>
+          <w:color w:val="1F2A38"/>
+          <w:sz w:val="22"/>
+          <w:szCs w:val="22"/>
+        </w:rPr>
+        <w:t xml:space="preserve">Si tenés las dos versiones instaladas</w:t>
+      </w:r>
+    </w:p>
+    <w:p>
+      <w:pPr>
+        <w:spacing w:after="160" w:line="300"/>
+      </w:pPr>
+      <w:r>
+        <w:rPr>
+          <w:color w:val="1F2A38"/>
+          <w:sz w:val="21"/>
+          <w:szCs w:val="21"/>
+        </w:rPr>
+        <w:t xml:space="preserve">Puede pasar que java -version siga respondiendo 21 después de instalar la 17. En ese caso hay que decirle explícitamente cuál usar. En Windows, cerrá la terminal, abrí una nueva y escribí esto antes de compilar, ajustando la ruta a donde quedó instalada la 17:</w:t>
+      </w:r>
+    </w:p>
+    <w:p>
+      <w:pPr>
+        <w:pBdr>
+          <w:left w:val="single" w:color="3B5D8C" w:sz="12" w:space="6"/>
+        </w:pBdr>
+        <w:shd w:fill="F1F3F6" w:val="clear"/>
+        <w:spacing w:after="140" w:before="60"/>
+        <w:ind w:left="220"/>
+      </w:pPr>
+      <w:r>
+        <w:rPr>
+          <w:rFonts w:ascii="Consolas" w:hAnsi="Consolas" w:cs="Consolas"/>
+          <w:color w:val="1F2A38"/>
+          <w:sz w:val="19"/>
+          <w:szCs w:val="19"/>
+        </w:rPr>
+        <w:t xml:space="preserve">set JAVA_HOME=C:\Program Files\Eclipse Adoptium\jdk-17</w:t>
+      </w:r>
+    </w:p>
+    <w:p>
+      <w:pPr>
+        <w:spacing w:after="160" w:line="300"/>
+      </w:pPr>
+      <w:r>
+        <w:rPr>
+          <w:color w:val="1F2A38"/>
+          <w:sz w:val="21"/>
+          <w:szCs w:val="21"/>
+        </w:rPr>
+        <w:t xml:space="preserve">Para saber la ruta exacta, mirá dentro de C:\Program Files\Eclipse Adoptium: va a haber una carpeta que empieza con jdk-17. Ese ajuste dura mientras la terminal esté abierta, así que hay que repetirlo si la cerrás.</w:t>
+      </w:r>
     </w:p>
     <w:p>
       <w:pPr>
@@ -1663,7 +1724,335 @@
           <w:sz w:val="30"/>
           <w:szCs w:val="30"/>
         </w:rPr>
-        <w:t xml:space="preserve">10. Opcional: una comprobación sin Minecraft</w:t>
+        <w:t xml:space="preserve">10. Errores conocidos y qué significan</w:t>
+      </w:r>
+    </w:p>
+    <w:tbl>
+      <w:tblPr>
+        <w:tblW w:type="pct" w:w="100%"/>
+        <w:tblBorders>
+          <w:top w:val="single" w:color="C9CFD6" w:sz="2"/>
+          <w:left w:val="single" w:color="C9CFD6" w:sz="2"/>
+          <w:bottom w:val="single" w:color="C9CFD6" w:sz="2"/>
+          <w:right w:val="single" w:color="C9CFD6" w:sz="2"/>
+          <w:insideH w:val="single" w:color="C9CFD6" w:sz="2"/>
+          <w:insideV w:val="single" w:color="C9CFD6" w:sz="2"/>
+        </w:tblBorders>
+      </w:tblPr>
+      <w:tblGrid>
+        <w:gridCol w:w="3400"/>
+        <w:gridCol w:w="5960"/>
+      </w:tblGrid>
+      <w:tr>
+        <w:tc>
+          <w:tcPr>
+            <w:tcW w:type="dxa" w:w="3400"/>
+            <w:shd w:fill="3B5D8C" w:val="clear"/>
+            <w:tcMar>
+              <w:top w:type="dxa" w:w="100"/>
+              <w:left w:type="dxa" w:w="140"/>
+              <w:bottom w:type="dxa" w:w="100"/>
+              <w:right w:type="dxa" w:w="140"/>
+            </w:tcMar>
+            <w:vAlign w:val="center"/>
+          </w:tcPr>
+          <w:p>
+            <w:r>
+              <w:rPr>
+                <w:b/>
+                <w:bCs/>
+                <w:color w:val="FFFFFF"/>
+                <w:sz w:val="19"/>
+                <w:szCs w:val="19"/>
+              </w:rPr>
+              <w:t xml:space="preserve">Mensaje</w:t>
+            </w:r>
+          </w:p>
+        </w:tc>
+        <w:tc>
+          <w:tcPr>
+            <w:tcW w:type="dxa" w:w="5960"/>
+            <w:shd w:fill="3B5D8C" w:val="clear"/>
+            <w:tcMar>
+              <w:top w:type="dxa" w:w="100"/>
+              <w:left w:type="dxa" w:w="140"/>
+              <w:bottom w:type="dxa" w:w="100"/>
+              <w:right w:type="dxa" w:w="140"/>
+            </w:tcMar>
+            <w:vAlign w:val="center"/>
+          </w:tcPr>
+          <w:p>
+            <w:r>
+              <w:rPr>
+                <w:b/>
+                <w:bCs/>
+                <w:color w:val="FFFFFF"/>
+                <w:sz w:val="19"/>
+                <w:szCs w:val="19"/>
+              </w:rPr>
+              <w:t xml:space="preserve">Qué pasa</w:t>
+            </w:r>
+          </w:p>
+        </w:tc>
+      </w:tr>
+      <w:tr>
+        <w:tc>
+          <w:tcPr>
+            <w:tcW w:type="dxa" w:w="3400"/>
+            <w:tcMar>
+              <w:top w:type="dxa" w:w="100"/>
+              <w:left w:type="dxa" w:w="140"/>
+              <w:bottom w:type="dxa" w:w="100"/>
+              <w:right w:type="dxa" w:w="140"/>
+            </w:tcMar>
+            <w:vAlign w:val="center"/>
+          </w:tcPr>
+          <w:p>
+            <w:r>
+              <w:rPr>
+                <w:rFonts w:ascii="Consolas" w:hAnsi="Consolas"/>
+                <w:color w:val="1F2A38"/>
+                <w:sz w:val="17"/>
+                <w:szCs w:val="17"/>
+              </w:rPr>
+              <w:t xml:space="preserve">gradlew.bat no se reconoce como un comando</w:t>
+            </w:r>
+          </w:p>
+        </w:tc>
+        <w:tc>
+          <w:tcPr>
+            <w:tcW w:type="dxa" w:w="5960"/>
+            <w:tcMar>
+              <w:top w:type="dxa" w:w="100"/>
+              <w:left w:type="dxa" w:w="140"/>
+              <w:bottom w:type="dxa" w:w="100"/>
+              <w:right w:type="dxa" w:w="140"/>
+            </w:tcMar>
+            <w:vAlign w:val="center"/>
+          </w:tcPr>
+          <w:p>
+            <w:r>
+              <w:rPr>
+                <w:color w:val="1F2A38"/>
+                <w:sz w:val="19"/>
+                <w:szCs w:val="19"/>
+              </w:rPr>
+              <w:t xml:space="preserve">Faltan los archivos del wrapper en la carpeta. Volvé a descargar el ZIP del proyecto: faltaban en las primeras versiones y ya están agregados.</w:t>
+            </w:r>
+          </w:p>
+        </w:tc>
+      </w:tr>
+      <w:tr>
+        <w:tc>
+          <w:tcPr>
+            <w:tcW w:type="dxa" w:w="3400"/>
+            <w:tcMar>
+              <w:top w:type="dxa" w:w="100"/>
+              <w:left w:type="dxa" w:w="140"/>
+              <w:bottom w:type="dxa" w:w="100"/>
+              <w:right w:type="dxa" w:w="140"/>
+            </w:tcMar>
+            <w:vAlign w:val="center"/>
+          </w:tcPr>
+          <w:p>
+            <w:r>
+              <w:rPr>
+                <w:rFonts w:ascii="Consolas" w:hAnsi="Consolas"/>
+                <w:color w:val="1F2A38"/>
+                <w:sz w:val="17"/>
+                <w:szCs w:val="17"/>
+              </w:rPr>
+              <w:t xml:space="preserve">Unsupported class file major version 65</w:t>
+            </w:r>
+          </w:p>
+        </w:tc>
+        <w:tc>
+          <w:tcPr>
+            <w:tcW w:type="dxa" w:w="5960"/>
+            <w:tcMar>
+              <w:top w:type="dxa" w:w="100"/>
+              <w:left w:type="dxa" w:w="140"/>
+              <w:bottom w:type="dxa" w:w="100"/>
+              <w:right w:type="dxa" w:w="140"/>
+            </w:tcMar>
+            <w:vAlign w:val="center"/>
+          </w:tcPr>
+          <w:p>
+            <w:r>
+              <w:rPr>
+                <w:color w:val="1F2A38"/>
+                <w:sz w:val="19"/>
+                <w:szCs w:val="19"/>
+              </w:rPr>
+              <w:t xml:space="preserve">Estás usando Java 21. Instalá la 17 y mirá el paso 1.</w:t>
+            </w:r>
+          </w:p>
+        </w:tc>
+      </w:tr>
+      <w:tr>
+        <w:tc>
+          <w:tcPr>
+            <w:tcW w:type="dxa" w:w="3400"/>
+            <w:tcMar>
+              <w:top w:type="dxa" w:w="100"/>
+              <w:left w:type="dxa" w:w="140"/>
+              <w:bottom w:type="dxa" w:w="100"/>
+              <w:right w:type="dxa" w:w="140"/>
+            </w:tcMar>
+            <w:vAlign w:val="center"/>
+          </w:tcPr>
+          <w:p>
+            <w:r>
+              <w:rPr>
+                <w:rFonts w:ascii="Consolas" w:hAnsi="Consolas"/>
+                <w:color w:val="1F2A38"/>
+                <w:sz w:val="17"/>
+                <w:szCs w:val="17"/>
+              </w:rPr>
+              <w:t xml:space="preserve">Unsupported class file major version 61 o similar</w:t>
+            </w:r>
+          </w:p>
+        </w:tc>
+        <w:tc>
+          <w:tcPr>
+            <w:tcW w:type="dxa" w:w="5960"/>
+            <w:tcMar>
+              <w:top w:type="dxa" w:w="100"/>
+              <w:left w:type="dxa" w:w="140"/>
+              <w:bottom w:type="dxa" w:w="100"/>
+              <w:right w:type="dxa" w:w="140"/>
+            </w:tcMar>
+            <w:vAlign w:val="center"/>
+          </w:tcPr>
+          <w:p>
+            <w:r>
+              <w:rPr>
+                <w:color w:val="1F2A38"/>
+                <w:sz w:val="19"/>
+                <w:szCs w:val="19"/>
+              </w:rPr>
+              <w:t xml:space="preserve">Lo mismo pero al revés: la versión de Java es más vieja de lo esperado.</w:t>
+            </w:r>
+          </w:p>
+        </w:tc>
+      </w:tr>
+      <w:tr>
+        <w:tc>
+          <w:tcPr>
+            <w:tcW w:type="dxa" w:w="3400"/>
+            <w:tcMar>
+              <w:top w:type="dxa" w:w="100"/>
+              <w:left w:type="dxa" w:w="140"/>
+              <w:bottom w:type="dxa" w:w="100"/>
+              <w:right w:type="dxa" w:w="140"/>
+            </w:tcMar>
+            <w:vAlign w:val="center"/>
+          </w:tcPr>
+          <w:p>
+            <w:r>
+              <w:rPr>
+                <w:rFonts w:ascii="Consolas" w:hAnsi="Consolas"/>
+                <w:color w:val="1F2A38"/>
+                <w:sz w:val="17"/>
+                <w:szCs w:val="17"/>
+              </w:rPr>
+              <w:t xml:space="preserve">Could not resolve net.minecraftforge</w:t>
+            </w:r>
+          </w:p>
+        </w:tc>
+        <w:tc>
+          <w:tcPr>
+            <w:tcW w:type="dxa" w:w="5960"/>
+            <w:tcMar>
+              <w:top w:type="dxa" w:w="100"/>
+              <w:left w:type="dxa" w:w="140"/>
+              <w:bottom w:type="dxa" w:w="100"/>
+              <w:right w:type="dxa" w:w="140"/>
+            </w:tcMar>
+            <w:vAlign w:val="center"/>
+          </w:tcPr>
+          <w:p>
+            <w:r>
+              <w:rPr>
+                <w:color w:val="1F2A38"/>
+                <w:sz w:val="19"/>
+                <w:szCs w:val="19"/>
+              </w:rPr>
+              <w:t xml:space="preserve">Problema de red, o la versión de Forge en gradle.properties no existe. Confirmala en files.minecraftforge.net para 1.20.1.</w:t>
+            </w:r>
+          </w:p>
+        </w:tc>
+      </w:tr>
+      <w:tr>
+        <w:tc>
+          <w:tcPr>
+            <w:tcW w:type="dxa" w:w="3400"/>
+            <w:tcMar>
+              <w:top w:type="dxa" w:w="100"/>
+              <w:left w:type="dxa" w:w="140"/>
+              <w:bottom w:type="dxa" w:w="100"/>
+              <w:right w:type="dxa" w:w="140"/>
+            </w:tcMar>
+            <w:vAlign w:val="center"/>
+          </w:tcPr>
+          <w:p>
+            <w:r>
+              <w:rPr>
+                <w:rFonts w:ascii="Consolas" w:hAnsi="Consolas"/>
+                <w:color w:val="1F2A38"/>
+                <w:sz w:val="17"/>
+                <w:szCs w:val="17"/>
+              </w:rPr>
+              <w:t xml:space="preserve">BUILD FAILED con errores que mencionan archivos .java</w:t>
+            </w:r>
+          </w:p>
+        </w:tc>
+        <w:tc>
+          <w:tcPr>
+            <w:tcW w:type="dxa" w:w="5960"/>
+            <w:tcMar>
+              <w:top w:type="dxa" w:w="100"/>
+              <w:left w:type="dxa" w:w="140"/>
+              <w:bottom w:type="dxa" w:w="100"/>
+              <w:right w:type="dxa" w:w="140"/>
+            </w:tcMar>
+            <w:vAlign w:val="center"/>
+          </w:tcPr>
+          <w:p>
+            <w:r>
+              <w:rPr>
+                <w:color w:val="1F2A38"/>
+                <w:sz w:val="19"/>
+                <w:szCs w:val="19"/>
+              </w:rPr>
+              <w:t xml:space="preserve">Es lo esperable: errores del código del mod. Copiá el texto y mandalo, no hay nada que puedas hacer de tu lado.</w:t>
+            </w:r>
+          </w:p>
+        </w:tc>
+      </w:tr>
+    </w:tbl>
+    <w:p>
+      <w:pPr>
+        <w:spacing w:after="160"/>
+      </w:pPr>
+    </w:p>
+    <w:p>
+      <w:pPr>
+        <w:pStyle w:val="Heading1"/>
+        <w:pBdr>
+          <w:bottom w:val="single" w:color="3B5D8C" w:sz="8" w:space="4"/>
+        </w:pBdr>
+        <w:spacing w:after="200" w:before="480"/>
+      </w:pPr>
+      <w:r>
+        <w:rPr>
+          <w:b/>
+          <w:bCs/>
+          <w:color w:val="1F2A38"/>
+          <w:sz w:val="30"/>
+          <w:szCs w:val="30"/>
+        </w:rPr>
+        <w:t xml:space="preserve">11. Opcional: una comprobación sin Minecraft</w:t>
       </w:r>
     </w:p>
     <w:p>

</xml_diff>